<commit_message>
docs: finalize tech stack (React, FastAPI, Supabase, Google OAuth, Telegram storage, Ollama)
</commit_message>
<xml_diff>
--- a/docs/VYNL_PRD_SRS_Architecture.docx
+++ b/docs/VYNL_PRD_SRS_Architecture.docx
@@ -192,11 +192,7 @@
           </w:tcPr>
           <w:p>
             <w:r>
-              <w:rPr>
-                <w:sz w:val="20"/>
-                <w:szCs w:val="20"/>
-              </w:rPr>
-              <w:t xml:space="preserve">Draft</w:t>
+              <w:t>Draft --- Technology Stack Defined</w:t>
             </w:r>
           </w:p>
         </w:tc>
@@ -237,11 +233,7 @@
           </w:tcPr>
           <w:p>
             <w:r>
-              <w:rPr>
-                <w:sz w:val="20"/>
-                <w:szCs w:val="20"/>
-              </w:rPr>
-              <w:t xml:space="preserve">09 August 2026</w:t>
+              <w:t>12 August 2026</w:t>
             </w:r>
           </w:p>
         </w:tc>
@@ -2004,11 +1996,7 @@
         <w:spacing w:after="90" w:line="276"/>
       </w:pPr>
       <w:r>
-        <w:rPr>
-          <w:sz w:val="22"/>
-          <w:szCs w:val="22"/>
-        </w:rPr>
-        <w:t xml:space="preserve">The exact technology stack for implementation has not been finalized at the time of this document; the accompanying System Architecture is described conceptually and is stack-agnostic.</w:t>
+        <w:t>The technology stack has been defined: React + Vite + TypeScript (Frontend), FastAPI (Backend), Supabase (Database without ORM), Google OAuth (Authentication), Telegram Private Channel (Audio Storage), and Ollama (Local LLM Provider).</w:t>
       </w:r>
     </w:p>
     <w:p>
@@ -2895,23 +2883,6 @@
           <w:sz w:val="22"/>
           <w:szCs w:val="22"/>
         </w:rPr>
-        <w:t xml:space="preserve">Which specific technology stack (backend framework, frontend framework, ML serving stack) will be finalized for implementation?</w:t>
-      </w:r>
-    </w:p>
-    <w:p>
-      <w:pPr>
-        <w:pStyle w:val="ListParagraph"/>
-        <w:numPr>
-          <w:ilvl w:val="0"/>
-          <w:numId w:val="2"/>
-        </w:numPr>
-        <w:spacing w:after="90" w:line="276"/>
-      </w:pPr>
-      <w:r>
-        <w:rPr>
-          <w:sz w:val="22"/>
-          <w:szCs w:val="22"/>
-        </w:rPr>
         <w:t xml:space="preserve">What are the licensing/rate-limit terms of the open-source Song API and fallback services at production scale?</w:t>
       </w:r>
     </w:p>
@@ -3144,11 +3115,7 @@
           </w:tcPr>
           <w:p>
             <w:r>
-              <w:rPr>
-                <w:sz w:val="20"/>
-                <w:szCs w:val="20"/>
-              </w:rPr>
-              <w:t xml:space="preserve">Draft</w:t>
+              <w:t>Draft --- Technology Stack Defined</w:t>
             </w:r>
           </w:p>
         </w:tc>
@@ -3189,11 +3156,7 @@
           </w:tcPr>
           <w:p>
             <w:r>
-              <w:rPr>
-                <w:sz w:val="20"/>
-                <w:szCs w:val="20"/>
-              </w:rPr>
-              <w:t xml:space="preserve">09 August 2026</w:t>
+              <w:t>12 August 2026</w:t>
             </w:r>
           </w:p>
         </w:tc>
@@ -4386,11 +4349,7 @@
         <w:spacing w:after="90" w:line="276"/>
       </w:pPr>
       <w:r>
-        <w:rPr>
-          <w:sz w:val="22"/>
-          <w:szCs w:val="22"/>
-        </w:rPr>
-        <w:t xml:space="preserve">Server-side: cloud or server-hosted backend services (implementation stack to be finalized; see System Architecture).</w:t>
+        <w:t>Server-side: cloud or server-hosted FastAPI (Python) backend service with Supabase (PostgreSQL) database.</w:t>
       </w:r>
     </w:p>
     <w:p>
@@ -4430,11 +4389,7 @@
         <w:spacing w:after="90" w:line="276"/>
       </w:pPr>
       <w:r>
-        <w:rPr>
-          <w:sz w:val="22"/>
-          <w:szCs w:val="22"/>
-        </w:rPr>
-        <w:t xml:space="preserve">The specific backend/frontend technology stack is not finalized; requirements in this document are stack-agnostic.</w:t>
+        <w:t>The backend technology stack is FastAPI (Python) with a Supabase database, and the frontend is React 18 + Vite + TypeScript.</w:t>
       </w:r>
     </w:p>
     <w:p>
@@ -9968,11 +9923,7 @@
           </w:tcPr>
           <w:p>
             <w:r>
-              <w:rPr>
-                <w:sz w:val="20"/>
-                <w:szCs w:val="20"/>
-              </w:rPr>
-              <w:t xml:space="preserve">Draft — Conceptual (technology stack not yet finalized)</w:t>
+              <w:t>Draft --- Technology Stack Defined</w:t>
             </w:r>
           </w:p>
         </w:tc>
@@ -10013,11 +9964,7 @@
           </w:tcPr>
           <w:p>
             <w:r>
-              <w:rPr>
-                <w:sz w:val="20"/>
-                <w:szCs w:val="20"/>
-              </w:rPr>
-              <w:t xml:space="preserve">09 August 2026</w:t>
+              <w:t>12 August 2026</w:t>
             </w:r>
           </w:p>
         </w:tc>
@@ -10088,11 +10035,7 @@
         <w:spacing w:after="160" w:line="276"/>
       </w:pPr>
       <w:r>
-        <w:rPr>
-          <w:sz w:val="22"/>
-          <w:szCs w:val="22"/>
-        </w:rPr>
-        <w:t xml:space="preserve">This document describes the architecture of VYNL at a conceptual, component level. Because the implementation technology stack has not yet been finalized, the architecture is expressed in terms of logical layers, services, data stores, and integration points rather than specific frameworks, languages, or vendor products. This allows the architecture to remain valid as concrete technology choices are made during detailed design, while still giving engineering teams a clear structural blueprint to implement against.</w:t>
+        <w:t>This document describes the architecture of VYNL. The core technology stack has been defined to guide the implementation of backend services, database storage, and integrations, while maintaining clean separation of concerns between layers.</w:t>
       </w:r>
     </w:p>
     <w:p>
@@ -10175,19 +10118,66 @@
     </w:p>
     <w:p>
       <w:pPr>
-        <w:pStyle w:val="ListParagraph"/>
-        <w:numPr>
-          <w:ilvl w:val="0"/>
-          <w:numId w:val="2"/>
-        </w:numPr>
-        <w:spacing w:after="90" w:line="276"/>
-      </w:pPr>
-      <w:r>
-        <w:rPr>
-          <w:sz w:val="22"/>
-          <w:szCs w:val="22"/>
-        </w:rPr>
-        <w:t xml:space="preserve">Stack-agnostic services: each logical service can be implemented and scaled independently, regardless of eventual technology choice.</w:t>
+        <w:pStyle w:val="Heading2"/>
+      </w:pPr>
+      <w:r>
+        <w:t>1.2 Core Technology Stack</w:t>
+      </w:r>
+    </w:p>
+    <w:p>
+      <w:pPr>
+        <w:pStyle w:val="ListParagraph"/>
+      </w:pPr>
+      <w:r>
+        <w:t>Frontend: React 18 + Vite + TypeScript (TSX), utilizing CSS Modules for component styling and framer-motion for transitions.</w:t>
+      </w:r>
+    </w:p>
+    <w:p>
+      <w:pPr>
+        <w:pStyle w:val="ListParagraph"/>
+      </w:pPr>
+      <w:r>
+        <w:t>Backend / API Layer: FastAPI (Python), providing asynchronous REST API endpoints and WebSockets for real-time collaborative playlists.</w:t>
+      </w:r>
+    </w:p>
+    <w:p>
+      <w:pPr>
+        <w:pStyle w:val="ListParagraph"/>
+      </w:pPr>
+      <w:r>
+        <w:t>Database: Supabase (PostgreSQL) is the primary relational database. No traditional ORM is used for the MVP; the backend interacts with the database directly using SQL drivers (asyncpg) or the official supabase-py client library.</w:t>
+      </w:r>
+    </w:p>
+    <w:p>
+      <w:pPr>
+        <w:pStyle w:val="ListParagraph"/>
+      </w:pPr>
+      <w:r>
+        <w:t>Audio Storage: Persistent storage in a Telegram Private Channel. Audio files are stored under Telegram File IDs, and streaming/download links are generated dynamically.</w:t>
+      </w:r>
+    </w:p>
+    <w:p>
+      <w:pPr>
+        <w:pStyle w:val="ListParagraph"/>
+      </w:pPr>
+      <w:r>
+        <w:t>Authentication: Google OAuth 2.0.</w:t>
+      </w:r>
+    </w:p>
+    <w:p>
+      <w:pPr>
+        <w:pStyle w:val="ListParagraph"/>
+      </w:pPr>
+      <w:r>
+        <w:t>LLM Provider: Local Ollama instance (running Llama 3 or similar model) used to generate explanations for recommendations.</w:t>
+      </w:r>
+    </w:p>
+    <w:p>
+      <w:pPr>
+        <w:pStyle w:val="ListParagraph"/>
+      </w:pPr>
+      <w:r>
+        <w:t>Machine Learning: pandas, numpy, and scikit-learn (or specialized recommendation tools like lightfm) for daily batch retraining.</w:t>
       </w:r>
     </w:p>
     <w:p>
@@ -11957,11 +11947,7 @@
         <w:spacing w:after="90" w:line="276"/>
       </w:pPr>
       <w:r>
-        <w:rPr>
-          <w:sz w:val="22"/>
-          <w:szCs w:val="22"/>
-        </w:rPr>
-        <w:t xml:space="preserve">Final backend/frontend technology stack and hosting/deployment model.</w:t>
+        <w:t>Whether backend services are deployed as independent microservices or as modules within a monolithic FastAPI backend for the MVP (monolithic modules are recommended for initial simplicity).</w:t>
       </w:r>
     </w:p>
     <w:p>
@@ -11974,11 +11960,7 @@
         <w:spacing w:after="90" w:line="276"/>
       </w:pPr>
       <w:r>
-        <w:rPr>
-          <w:sz w:val="22"/>
-          <w:szCs w:val="22"/>
-        </w:rPr>
-        <w:t xml:space="preserve">Whether core services are deployed as independent microservices or as modules within a monolithic backend for MVP.</w:t>
+        <w:t>The specific local model to serve via Ollama (e.g., Llama 3 8B, Mistral 7B) depending on system performance.</w:t>
       </w:r>
     </w:p>
     <w:p>
@@ -11991,11 +11973,7 @@
         <w:spacing w:after="90" w:line="276"/>
       </w:pPr>
       <w:r>
-        <w:rPr>
-          <w:sz w:val="22"/>
-          <w:szCs w:val="22"/>
-        </w:rPr>
-        <w:t xml:space="preserve">Choice of ML serving infrastructure and LLM provider/hosting for the explanation service.</w:t>
+        <w:t>Hosting and deployment topology for the FastAPI backend, Ollama server, and scheduled daily batch training scripts.</w:t>
       </w:r>
     </w:p>
     <w:p>

</xml_diff>